<commit_message>
Explain Lean proofs, psychology, novelty, and publication plans
Add a reader guide covering all 16 checked theorems, game theory, a proposed Durkheim model, and the pending psychology corpus import. Document primary formalization precedents and bounded novelty searches. Refresh readable PDF and DOCX outputs, navigation, local-link checks, and main-branch verification provenance.
</commit_message>
<xml_diff>
--- a/projects/solidarity-at-scale/outputs/solidarity-at-scale-paper.docx
+++ b/projects/solidarity-at-scale/outputs/solidarity-at-scale-paper.docx
@@ -270,9 +270,9 @@
         <w:tblLook w:firstColumn="1" w:firstRow="1" w:lastColumn="0" w:lastRow="0" w:noHBand="0" w:noVBand="1" w:val="04A0"/>
       </w:tblPr>
       <w:tblGrid>
-        <w:gridCol w:w="3312"/>
-        <w:gridCol w:w="3312"/>
-        <w:gridCol w:w="3312"/>
+        <w:gridCol w:w="2448"/>
+        <w:gridCol w:w="3744"/>
+        <w:gridCol w:w="3744"/>
       </w:tblGrid>
       <w:tr>
         <w:trPr>
@@ -281,7 +281,8 @@
         </w:trPr>
         <w:tc>
           <w:tcPr>
-            <w:tcW w:type="dxa" w:w="3312"/>
+            <w:tcW w:type="dxa" w:w="2448"/>
+            <w:vAlign w:val="center"/>
             <w:tcMar>
               <w:top w:w="75" w:type="dxa"/>
               <w:left w:w="75" w:type="dxa"/>
@@ -312,7 +313,8 @@
         </w:tc>
         <w:tc>
           <w:tcPr>
-            <w:tcW w:type="dxa" w:w="3312"/>
+            <w:tcW w:type="dxa" w:w="3744"/>
+            <w:vAlign w:val="center"/>
             <w:tcMar>
               <w:top w:w="75" w:type="dxa"/>
               <w:left w:w="75" w:type="dxa"/>
@@ -343,7 +345,8 @@
         </w:tc>
         <w:tc>
           <w:tcPr>
-            <w:tcW w:type="dxa" w:w="3312"/>
+            <w:tcW w:type="dxa" w:w="3744"/>
+            <w:vAlign w:val="center"/>
             <w:tcMar>
               <w:top w:w="75" w:type="dxa"/>
               <w:left w:w="75" w:type="dxa"/>
@@ -379,7 +382,8 @@
         </w:trPr>
         <w:tc>
           <w:tcPr>
-            <w:tcW w:type="dxa" w:w="3312"/>
+            <w:tcW w:type="dxa" w:w="2448"/>
+            <w:vAlign w:val="center"/>
             <w:tcMar>
               <w:top w:w="75" w:type="dxa"/>
               <w:left w:w="75" w:type="dxa"/>
@@ -409,7 +413,8 @@
         </w:tc>
         <w:tc>
           <w:tcPr>
-            <w:tcW w:type="dxa" w:w="3312"/>
+            <w:tcW w:type="dxa" w:w="3744"/>
+            <w:vAlign w:val="center"/>
             <w:tcMar>
               <w:top w:w="75" w:type="dxa"/>
               <w:left w:w="75" w:type="dxa"/>
@@ -439,7 +444,8 @@
         </w:tc>
         <w:tc>
           <w:tcPr>
-            <w:tcW w:type="dxa" w:w="3312"/>
+            <w:tcW w:type="dxa" w:w="3744"/>
+            <w:vAlign w:val="center"/>
             <w:tcMar>
               <w:top w:w="75" w:type="dxa"/>
               <w:left w:w="75" w:type="dxa"/>
@@ -474,7 +480,8 @@
         </w:trPr>
         <w:tc>
           <w:tcPr>
-            <w:tcW w:type="dxa" w:w="3312"/>
+            <w:tcW w:type="dxa" w:w="2448"/>
+            <w:vAlign w:val="center"/>
             <w:tcMar>
               <w:top w:w="75" w:type="dxa"/>
               <w:left w:w="75" w:type="dxa"/>
@@ -504,7 +511,8 @@
         </w:tc>
         <w:tc>
           <w:tcPr>
-            <w:tcW w:type="dxa" w:w="3312"/>
+            <w:tcW w:type="dxa" w:w="3744"/>
+            <w:vAlign w:val="center"/>
             <w:tcMar>
               <w:top w:w="75" w:type="dxa"/>
               <w:left w:w="75" w:type="dxa"/>
@@ -534,7 +542,8 @@
         </w:tc>
         <w:tc>
           <w:tcPr>
-            <w:tcW w:type="dxa" w:w="3312"/>
+            <w:tcW w:type="dxa" w:w="3744"/>
+            <w:vAlign w:val="center"/>
             <w:tcMar>
               <w:top w:w="75" w:type="dxa"/>
               <w:left w:w="75" w:type="dxa"/>
@@ -3602,7 +3611,7 @@
       <w:outlineLvl w:val="0"/>
     </w:pPr>
     <w:rPr>
-      <w:rFonts w:asciiTheme="majorHAnsi" w:eastAsiaTheme="majorEastAsia" w:hAnsiTheme="majorHAnsi" w:cstheme="majorBidi" w:ascii="Times New Roman" w:hAnsi="Times New Roman"/>
+      <w:rFonts w:ascii="Times New Roman" w:hAnsi="Times New Roman"/>
       <w:b/>
       <w:bCs/>
       <w:color w:val="000000"/>
@@ -3626,7 +3635,7 @@
       <w:outlineLvl w:val="1"/>
     </w:pPr>
     <w:rPr>
-      <w:rFonts w:asciiTheme="majorHAnsi" w:eastAsiaTheme="majorEastAsia" w:hAnsiTheme="majorHAnsi" w:cstheme="majorBidi" w:ascii="Times New Roman" w:hAnsi="Times New Roman"/>
+      <w:rFonts w:ascii="Times New Roman" w:hAnsi="Times New Roman"/>
       <w:b/>
       <w:bCs/>
       <w:color w:val="000000"/>
@@ -3650,7 +3659,7 @@
       <w:outlineLvl w:val="2"/>
     </w:pPr>
     <w:rPr>
-      <w:rFonts w:asciiTheme="majorHAnsi" w:eastAsiaTheme="majorEastAsia" w:hAnsiTheme="majorHAnsi" w:cstheme="majorBidi" w:ascii="Times New Roman" w:hAnsi="Times New Roman"/>
+      <w:rFonts w:ascii="Times New Roman" w:hAnsi="Times New Roman"/>
       <w:b/>
       <w:bCs/>
       <w:color w:val="000000"/>
@@ -3885,14 +3894,11 @@
     <w:qFormat/>
     <w:rsid w:val="00FC693F"/>
     <w:pPr>
-      <w:pBdr>
-        <w:bottom w:val="single" w:sz="8" w:space="4" w:color="4F81BD" w:themeColor="accent1"/>
-      </w:pBdr>
       <w:spacing w:after="100" w:line="240" w:lineRule="auto"/>
       <w:contextualSpacing/>
     </w:pPr>
     <w:rPr>
-      <w:rFonts w:asciiTheme="majorHAnsi" w:eastAsiaTheme="majorEastAsia" w:hAnsiTheme="majorHAnsi" w:cstheme="majorBidi" w:ascii="Times New Roman" w:hAnsi="Times New Roman"/>
+      <w:rFonts w:ascii="Times New Roman" w:hAnsi="Times New Roman"/>
       <w:b/>
       <w:color w:val="000000"/>
       <w:spacing w:val="5"/>
@@ -3931,7 +3937,7 @@
       <w:spacing w:after="160"/>
     </w:pPr>
     <w:rPr>
-      <w:rFonts w:asciiTheme="majorHAnsi" w:eastAsiaTheme="majorEastAsia" w:hAnsiTheme="majorHAnsi" w:cstheme="majorBidi" w:ascii="Times New Roman" w:hAnsi="Times New Roman"/>
+      <w:rFonts w:ascii="Times New Roman" w:hAnsi="Times New Roman"/>
       <w:i/>
       <w:iCs/>
       <w:color w:val="000000"/>

</xml_diff>